<commit_message>
Finalize Round 2 human testing, contributions and verified model limitation
</commit_message>
<xml_diff>
--- a/docs/submission/VeriBrand_Round2_Update.docx
+++ b/docs/submission/VeriBrand_Round2_Update.docx
@@ -59,7 +59,7 @@
     </w:p>
     <w:p>
       <w:r>
-        <w:t>Roles are simulated, not authentication. This shared hackathon deployment is not a production service. Human testing results and Charan's contribution remain awaiting input.</w:t>
+        <w:t>Roles are simulated, not authentication. This shared hackathon deployment is not a production service. The team observed three informal volunteer sessions after deployment; their notes and the supplied team contributions are included.</w:t>
       </w:r>
     </w:p>
     <w:p>
@@ -72,7 +72,7 @@
     </w:p>
     <w:p>
       <w:r>
-        <w:t>The plan baseline below is the team-supplied build brief; the original Round 1 document was not independently inspected.</w:t>
+        <w:t>This comparison describes our Round 1 plan (Team 27) and the Round 2 delivery.</w:t>
       </w:r>
     </w:p>
     <w:tbl>
@@ -120,7 +120,7 @@
                 <w:color w:val="FFFFFF"/>
                 <w:sz w:val="19"/>
               </w:rPr>
-              <w:t>Plan baseline</w:t>
+              <w:t>Our Round 1 plan</w:t>
             </w:r>
           </w:p>
         </w:tc>
@@ -221,7 +221,7 @@
                 <w:color w:val="000000"/>
                 <w:sz w:val="19"/>
               </w:rPr>
-              <w:t>Gemini</w:t>
+              <w:t>Gemini API</w:t>
             </w:r>
           </w:p>
         </w:tc>
@@ -285,7 +285,7 @@
                 <w:color w:val="000000"/>
                 <w:sz w:val="19"/>
               </w:rPr>
-              <w:t>Use the supplied provider; degrade safely</w:t>
+              <w:t>Use the existing provider; degrade safely</w:t>
             </w:r>
           </w:p>
         </w:tc>
@@ -322,7 +322,7 @@
                 <w:color w:val="000000"/>
                 <w:sz w:val="19"/>
               </w:rPr>
-              <w:t>Supabase or PostgreSQL</w:t>
+              <w:t>Supabase/PostgreSQL</w:t>
             </w:r>
           </w:p>
         </w:tc>
@@ -726,7 +726,7 @@
                 <w:color w:val="000000"/>
                 <w:sz w:val="19"/>
               </w:rPr>
-              <w:t>Image and document review</w:t>
+              <w:t>Image and DOCX/PDF review in scope</w:t>
             </w:r>
           </w:p>
         </w:tc>
@@ -758,7 +758,7 @@
                 <w:color w:val="000000"/>
                 <w:sz w:val="19"/>
               </w:rPr>
-              <w:t>Text review only</w:t>
+              <w:t>Text review only; formats in Round 3</w:t>
             </w:r>
           </w:p>
         </w:tc>
@@ -827,7 +827,7 @@
                 <w:color w:val="000000"/>
                 <w:sz w:val="19"/>
               </w:rPr>
-              <w:t>Rule implementation choice</w:t>
+              <w:t>Three planned improvements</w:t>
             </w:r>
           </w:p>
         </w:tc>
@@ -859,7 +859,7 @@
                 <w:color w:val="000000"/>
                 <w:sz w:val="19"/>
               </w:rPr>
-              <w:t>Metadata rules, grounding and revalidation</w:t>
+              <w:t>Clarity insights, multi-format and evaluation harness retained for Round 3</w:t>
             </w:r>
           </w:p>
         </w:tc>
@@ -891,108 +891,7 @@
                 <w:color w:val="000000"/>
                 <w:sz w:val="19"/>
               </w:rPr>
-              <w:t>Expose sources and reject unsafe wording</w:t>
-            </w:r>
-          </w:p>
-        </w:tc>
-      </w:tr>
-      <w:tr>
-        <w:trPr>
-          <w:cantSplit/>
-        </w:trPr>
-        <w:tc>
-          <w:tcPr>
-            <w:tcW w:type="dxa" w:w="2160"/>
-            <w:vAlign w:val="center"/>
-            <w:tcBorders>
-              <w:top w:val="single" w:sz="4" w:color="D9D9D9"/>
-              <w:left w:val="single" w:sz="4" w:color="D9D9D9"/>
-              <w:bottom w:val="single" w:sz="4" w:color="D9D9D9"/>
-              <w:right w:val="single" w:sz="4" w:color="D9D9D9"/>
-            </w:tcBorders>
-            <w:shd w:fill="FFFFFF"/>
-            <w:tcMar>
-              <w:top w:w="85" w:type="dxa"/>
-              <w:left w:w="85" w:type="dxa"/>
-              <w:bottom w:w="85" w:type="dxa"/>
-              <w:right w:w="85" w:type="dxa"/>
-            </w:tcMar>
-          </w:tcPr>
-          <w:p>
-            <w:pPr>
-              <w:spacing w:after="40" w:line="250" w:lineRule="auto"/>
-            </w:pPr>
-            <w:r>
-              <w:rPr>
-                <w:b w:val="0"/>
-                <w:color w:val="000000"/>
-                <w:sz w:val="19"/>
-              </w:rPr>
-              <w:t>Demo reliability choice</w:t>
-            </w:r>
-          </w:p>
-        </w:tc>
-        <w:tc>
-          <w:tcPr>
-            <w:tcW w:type="dxa" w:w="3816"/>
-            <w:vAlign w:val="center"/>
-            <w:tcBorders>
-              <w:top w:val="single" w:sz="4" w:color="D9D9D9"/>
-              <w:left w:val="single" w:sz="4" w:color="D9D9D9"/>
-              <w:bottom w:val="single" w:sz="4" w:color="D9D9D9"/>
-              <w:right w:val="single" w:sz="4" w:color="D9D9D9"/>
-            </w:tcBorders>
-            <w:shd w:fill="FFFFFF"/>
-            <w:tcMar>
-              <w:top w:w="85" w:type="dxa"/>
-              <w:left w:w="85" w:type="dxa"/>
-              <w:bottom w:w="85" w:type="dxa"/>
-              <w:right w:w="85" w:type="dxa"/>
-            </w:tcMar>
-          </w:tcPr>
-          <w:p>
-            <w:pPr>
-              <w:spacing w:after="40" w:line="250" w:lineRule="auto"/>
-            </w:pPr>
-            <w:r>
-              <w:rPr>
-                <w:b w:val="0"/>
-                <w:color w:val="000000"/>
-                <w:sz w:val="19"/>
-              </w:rPr>
-              <w:t>KB-matched precomputed sample cache</w:t>
-            </w:r>
-          </w:p>
-        </w:tc>
-        <w:tc>
-          <w:tcPr>
-            <w:tcW w:type="dxa" w:w="3816"/>
-            <w:vAlign w:val="center"/>
-            <w:tcBorders>
-              <w:top w:val="single" w:sz="4" w:color="D9D9D9"/>
-              <w:left w:val="single" w:sz="4" w:color="D9D9D9"/>
-              <w:bottom w:val="single" w:sz="4" w:color="D9D9D9"/>
-              <w:right w:val="single" w:sz="4" w:color="D9D9D9"/>
-            </w:tcBorders>
-            <w:shd w:fill="FFFFFF"/>
-            <w:tcMar>
-              <w:top w:w="85" w:type="dxa"/>
-              <w:left w:w="85" w:type="dxa"/>
-              <w:bottom w:w="85" w:type="dxa"/>
-              <w:right w:w="85" w:type="dxa"/>
-            </w:tcMar>
-          </w:tcPr>
-          <w:p>
-            <w:pPr>
-              <w:spacing w:after="40" w:line="250" w:lineRule="auto"/>
-            </w:pPr>
-            <w:r>
-              <w:rPr>
-                <w:b w:val="0"/>
-                <w:color w:val="000000"/>
-                <w:sz w:val="19"/>
-              </w:rPr>
-              <w:t>Reduce judging latency and provider use</w:t>
+              <w:t>Keep the planned direction with concrete designs</w:t>
             </w:r>
           </w:p>
         </w:tc>
@@ -1002,6 +901,11 @@
       <w:pPr>
         <w:spacing w:after="0"/>
       </w:pPr>
+    </w:p>
+    <w:p>
+      <w:r>
+        <w:t>Additional Round 2 decisions include metadata-driven rules, grounding and replacement revalidation, plus a KB-matched precomputed sample cache to reduce latency and provider use.</w:t>
+      </w:r>
     </w:p>
     <w:p>
       <w:r>
@@ -1725,7 +1629,7 @@
     </w:p>
     <w:p>
       <w:r>
-        <w:t>The primary model was verified live during this submission check. The fallback appeared in the original saved run. The configured third model has not been verified live; mocked tests establish fallback control flow, not provider availability.</w:t>
+        <w:t>The primary model was verified live during the submission check; the fallback appeared in the original saved run. The configured third model remains not verified live: one minimal JSON-mode call on 22 October 2026 returned HTTP 403, model_permission_blocked_org, because the organization blocks it. No retry or app-code change was made.</w:t>
       </w:r>
     </w:p>
     <w:p>
@@ -3136,7 +3040,7 @@
         <w:spacing w:after="100"/>
       </w:pPr>
       <w:r>
-        <w:t>The third configured model is not verified live. Token estimates are not a preflight guarantee; other uses of the same key are invisible locally.</w:t>
+        <w:t>The third model is not verified live: one JSON-mode call returned HTTP 403, model_permission_blocked_org, on 22 October 2026. Other uses of the same key are invisible to local counters.</w:t>
       </w:r>
     </w:p>
     <w:p>
@@ -3181,7 +3085,7 @@
         <w:spacing w:after="100"/>
       </w:pPr>
       <w:r>
-        <w:t>No human usability results were supplied. Automated public checks found no blocking core failure; this is not a production or load audit.</w:t>
+        <w:t>Usability evidence is limited to three informal volunteer sessions; no formal study or independent accuracy evaluation has been done.</w:t>
       </w:r>
     </w:p>
     <w:p>
@@ -3225,25 +3129,7 @@
     </w:p>
     <w:p>
       <w:r>
-        <w:t>[[HUMAN: Charan to describe only what he actually did]]</w:t>
-      </w:r>
-    </w:p>
-    <w:p>
-      <w:pPr>
-        <w:pStyle w:val="Heading2"/>
-      </w:pPr>
-      <w:r>
-        <w:t>User testing</w:t>
-      </w:r>
-    </w:p>
-    <w:p>
-      <w:r>
-        <w:t>[[HUMAN: add results]]</w:t>
-      </w:r>
-    </w:p>
-    <w:p>
-      <w:r>
-        <w:t>No testers, completion times or participant quotes are claimed. docs/USER_TESTING.md is a ready-to-use sheet with tester initials, role, date, five tasks, time per task, hesitation, bugs and one quote; results are empty. Automated verification is recorded separately.</w:t>
+        <w:t>&lt;&lt; Charan reviewed the review-engine code with Dheeraj, ran the test suite, and took part in the live testing, Backend, coding implementation ideas &gt;&gt;</w:t>
       </w:r>
     </w:p>
     <w:p>
@@ -3274,7 +3160,120 @@
     </w:p>
     <w:p>
       <w:r>
-        <w:t>Implementation and test evidence are in this repository. Round 1 comparisons use the team-supplied plan description; contribution statements use the team's explicit confirmation. Round 3 pages describe proposed designs and future acceptance measures, not completed features. Full records: docs/submission/VERIFICATION.md, docs/AI_DISCLOSURE.md and docs/KNOWN_ISSUES.md.</w:t>
+        <w:t>Implementation and automated test evidence are in this repository. The comparison names our Round 1 plan (Team 27). Contributions and informal session notes are the team's supplied facts. Round 3 pages describe proposed designs and future acceptance measures, not completed features. Full records: docs/submission/VERIFICATION.md, docs/AI_DISCLOSURE.md and docs/KNOWN_ISSUES.md.</w:t>
+      </w:r>
+    </w:p>
+    <w:p>
+      <w:r>
+        <w:br w:type="page"/>
+      </w:r>
+    </w:p>
+    <w:p>
+      <w:pPr>
+        <w:pStyle w:val="Heading1"/>
+      </w:pPr>
+      <w:r>
+        <w:t>Informal user testing</w:t>
+      </w:r>
+    </w:p>
+    <w:p>
+      <w:r>
+        <w:t>Informal, n=3. Run and observed by the team on the live site on 22 October 2026, after deployment. The following are the supplied observer notes.</w:t>
+      </w:r>
+    </w:p>
+    <w:p>
+      <w:pPr>
+        <w:pStyle w:val="Heading2"/>
+      </w:pPr>
+      <w:r>
+        <w:t>Tester 1</w:t>
+      </w:r>
+    </w:p>
+    <w:p>
+      <w:r>
+        <w:t>Approximate total session time: about 4 minutes.</w:t>
+      </w:r>
+    </w:p>
+    <w:p>
+      <w:r>
+        <w:t>Learned the product from the guided demo, completed the journey, relied on the AI-suggested findings and checked them against the knowledge base, and acted as the Manager role.</w:t>
+      </w:r>
+    </w:p>
+    <w:p>
+      <w:pPr>
+        <w:pStyle w:val="Heading2"/>
+      </w:pPr>
+      <w:r>
+        <w:t>Tester 2</w:t>
+      </w:r>
+    </w:p>
+    <w:p>
+      <w:r>
+        <w:t>Approximate total session time: about 6 minutes.</w:t>
+      </w:r>
+    </w:p>
+    <w:p>
+      <w:r>
+        <w:t>Used a sample draft and switched roles freely. Said a separate Reviewer role felt unnecessary and preferred approving directly as Manager.</w:t>
+      </w:r>
+    </w:p>
+    <w:p>
+      <w:r>
+        <w:t>Observer note: This is one tester's reaction to the Reviewer step.</w:t>
+      </w:r>
+    </w:p>
+    <w:p>
+      <w:pPr>
+        <w:pStyle w:val="Heading2"/>
+      </w:pPr>
+      <w:r>
+        <w:t>Tester 3</w:t>
+      </w:r>
+    </w:p>
+    <w:p>
+      <w:r>
+        <w:t>Approximate total session time: about 5 minutes.</w:t>
+      </w:r>
+    </w:p>
+    <w:p>
+      <w:r>
+        <w:t>Used a sample draft, followed the AI suggestions and checked them against the knowledge base.</w:t>
+      </w:r>
+    </w:p>
+    <w:p>
+      <w:pPr>
+        <w:pStyle w:val="Heading2"/>
+      </w:pPr>
+      <w:r>
+        <w:t>Common observation</w:t>
+      </w:r>
+    </w:p>
+    <w:p>
+      <w:r>
+        <w:t>All three relied on the AI-suggested findings and verified them using the visible source line:</w:t>
+      </w:r>
+    </w:p>
+    <w:p>
+      <w:r>
+        <w:t>Source: organisation-approved knowledge base · Fictional Acme Hydrate</w:t>
+      </w:r>
+    </w:p>
+    <w:p>
+      <w:pPr>
+        <w:pStyle w:val="Heading2"/>
+      </w:pPr>
+      <w:r>
+        <w:t>Limits</w:t>
+      </w:r>
+    </w:p>
+    <w:p>
+      <w:r>
+        <w:t>Three volunteers, informal, observed by the team, no timing of individual tasks, no formal questionnaire. Not statistically meaningful. The test sessions left content items in the live demo workspace.</w:t>
+      </w:r>
+    </w:p>
+    <w:p>
+      <w:r>
+        <w:t>Usability evidence is limited to three informal volunteer sessions; no formal study or independent accuracy evaluation has been done.</w:t>
       </w:r>
     </w:p>
     <w:p>

</xml_diff>